<commit_message>
Updated the Dynamic Analysis Perform Analysis Procedure document (referred to the instrument element activity as a process)
</commit_message>
<xml_diff>
--- a/source/reference_documents/tertiary_documents/implementation/Dynamic Analysis/perform analysis/Dynamic Analysis - Perform Analysis.docx
+++ b/source/reference_documents/tertiary_documents/implementation/Dynamic Analysis/perform analysis/Dynamic Analysis - Perform Analysis.docx
@@ -40,7 +40,7 @@
         <w:t xml:space="preserve">Version </w:t>
       </w:r>
       <w:r>
-        <w:t>1</w:t>
+        <w:t>2</w:t>
       </w:r>
     </w:p>
     <w:p>
@@ -57,7 +57,7 @@
         <w:rPr>
           <w:noProof/>
         </w:rPr>
-        <w:t>10/31/25 1:13 PM</w:t>
+        <w:t>11/3/25 9:57 AM</w:t>
       </w:r>
       <w:r>
         <w:fldChar w:fldCharType="end"/>
@@ -885,7 +885,13 @@
         <w:t>.</w:t>
       </w:r>
       <w:r>
-        <w:t xml:space="preserve"> We come back to them because although they should have been addressed during the instrumentation process and the pre-flight of the test within the CI/CD system, these may still need to be addressed within the context of the live CI/CD process.</w:t>
+        <w:t xml:space="preserve"> We come back to them because although they should have been addressed during the instrumentation </w:t>
+      </w:r>
+      <w:r>
+        <w:t>activity</w:t>
+      </w:r>
+      <w:r>
+        <w:t xml:space="preserve"> and the pre-flight of the test within the CI/CD system, these may still need to be addressed within the context of the live CI/CD process.</w:t>
       </w:r>
     </w:p>
     <w:p>

</xml_diff>